<commit_message>
Drop low editorial findings from Q2 review (keep 20 substantive items)
</commit_message>
<xml_diff>
--- a/XAI_Initial_Findings_DAEA.docx
+++ b/XAI_Initial_Findings_DAEA.docx
@@ -1495,144 +1495,6 @@
           </w:p>
         </w:tc>
       </w:tr>
-      <w:tr>
-        <w:tc>
-          <w:tcPr>
-            <w:tcW w:type="dxa" w:w="432"/>
-          </w:tcPr>
-          <w:p>
-            <w:r>
-              <w:rPr>
-                <w:sz w:val="20"/>
-              </w:rPr>
-              <w:t>21</w:t>
-            </w:r>
-          </w:p>
-        </w:tc>
-        <w:tc>
-          <w:tcPr>
-            <w:tcW w:type="dxa" w:w="2304"/>
-          </w:tcPr>
-          <w:p>
-            <w:r>
-              <w:rPr>
-                <w:sz w:val="20"/>
-              </w:rPr>
-              <w:t>Editorial — Duplicated sentences and language errors</w:t>
-            </w:r>
-          </w:p>
-        </w:tc>
-        <w:tc>
-          <w:tcPr>
-            <w:tcW w:type="dxa" w:w="1008"/>
-          </w:tcPr>
-          <w:p>
-            <w:r/>
-            <w:r>
-              <w:rPr>
-                <w:b/>
-                <w:color w:val="555555"/>
-              </w:rPr>
-              <w:t>Minor</w:t>
-            </w:r>
-          </w:p>
-        </w:tc>
-        <w:tc>
-          <w:tcPr>
-            <w:tcW w:type="dxa" w:w="4896"/>
-          </w:tcPr>
-          <w:p>
-            <w:r>
-              <w:rPr>
-                <w:sz w:val="20"/>
-              </w:rPr>
-              <w:t>Several passages contain near-verbatim duplicated sentences (the abstract repeats the DAEA/XAI-DSS sentence; Section 1 has "Third… Third…"; Sections 2.5 and 3.3 repeat content) and typos appear ("eexperiments," "diwarnsent," "boostrap"). This level of editing is below Q2 expectations and signals insufficient proofreading.</w:t>
-            </w:r>
-          </w:p>
-        </w:tc>
-        <w:tc>
-          <w:tcPr>
-            <w:tcW w:type="dxa" w:w="4320"/>
-          </w:tcPr>
-          <w:p>
-            <w:r>
-              <w:rPr>
-                <w:sz w:val="20"/>
-              </w:rPr>
-              <w:t>Perform a thorough professional language edit; remove all duplicated sentences and typos before resubmission.</w:t>
-            </w:r>
-          </w:p>
-        </w:tc>
-      </w:tr>
-      <w:tr>
-        <w:tc>
-          <w:tcPr>
-            <w:tcW w:type="dxa" w:w="432"/>
-          </w:tcPr>
-          <w:p>
-            <w:r>
-              <w:rPr>
-                <w:sz w:val="20"/>
-              </w:rPr>
-              <w:t>22</w:t>
-            </w:r>
-          </w:p>
-        </w:tc>
-        <w:tc>
-          <w:tcPr>
-            <w:tcW w:type="dxa" w:w="2304"/>
-          </w:tcPr>
-          <w:p>
-            <w:r>
-              <w:rPr>
-                <w:sz w:val="20"/>
-              </w:rPr>
-              <w:t>Editorial — Equations not typeset</w:t>
-            </w:r>
-          </w:p>
-        </w:tc>
-        <w:tc>
-          <w:tcPr>
-            <w:tcW w:type="dxa" w:w="1008"/>
-          </w:tcPr>
-          <w:p>
-            <w:r/>
-            <w:r>
-              <w:rPr>
-                <w:b/>
-                <w:color w:val="555555"/>
-              </w:rPr>
-              <w:t>Minor</w:t>
-            </w:r>
-          </w:p>
-        </w:tc>
-        <w:tc>
-          <w:tcPr>
-            <w:tcW w:type="dxa" w:w="4896"/>
-          </w:tcPr>
-          <w:p>
-            <w:r>
-              <w:rPr>
-                <w:sz w:val="20"/>
-              </w:rPr>
-              <w:t>Equations (1)–(3) appear as empty/placeholder lines (e.g., the general predictive mapping and the logistic posterior are blank). Several symbols are referenced without rendering.</w:t>
-            </w:r>
-          </w:p>
-        </w:tc>
-        <w:tc>
-          <w:tcPr>
-            <w:tcW w:type="dxa" w:w="4320"/>
-          </w:tcPr>
-          <w:p>
-            <w:r>
-              <w:rPr>
-                <w:sz w:val="20"/>
-              </w:rPr>
-              <w:t>Properly typeset all equations and define every symbol; verify they survive PDF conversion.</w:t>
-            </w:r>
-          </w:p>
-        </w:tc>
-      </w:tr>
     </w:tbl>
     <w:sectPr>
       <w:pgSz w:w="12240" w:h="15840"/>

</xml_diff>

<commit_message>
Keep publication blockers only (4 Critical + 13 Major); drop Minor items
</commit_message>
<xml_diff>
--- a/XAI_Initial_Findings_DAEA.docx
+++ b/XAI_Initial_Findings_DAEA.docx
@@ -21,7 +21,7 @@
           <w:i/>
           <w:sz w:val="20"/>
         </w:rPr>
-        <w:t>Pre-submission due-diligence review against Scopus Q2 expectations. Findings are ordered by severity (Critical → Major → Minor). Each item references concrete evidence from the manuscript tables/sections.</w:t>
+        <w:t>Pre-submission due-diligence review against Scopus Q2 expectations. Lists publication blockers only (Critical → Major). Each item references concrete evidence from the manuscript tables/sections.</w:t>
       </w:r>
     </w:p>
     <w:p/>
@@ -1288,213 +1288,6 @@
           </w:p>
         </w:tc>
       </w:tr>
-      <w:tr>
-        <w:tc>
-          <w:tcPr>
-            <w:tcW w:type="dxa" w:w="432"/>
-          </w:tcPr>
-          <w:p>
-            <w:r>
-              <w:rPr>
-                <w:sz w:val="20"/>
-              </w:rPr>
-              <w:t>18</w:t>
-            </w:r>
-          </w:p>
-        </w:tc>
-        <w:tc>
-          <w:tcPr>
-            <w:tcW w:type="dxa" w:w="2304"/>
-          </w:tcPr>
-          <w:p>
-            <w:r>
-              <w:rPr>
-                <w:sz w:val="20"/>
-              </w:rPr>
-              <w:t>Calibration Methodology — SMOTE×calibration interaction unaddressed</w:t>
-            </w:r>
-          </w:p>
-        </w:tc>
-        <w:tc>
-          <w:tcPr>
-            <w:tcW w:type="dxa" w:w="1008"/>
-          </w:tcPr>
-          <w:p>
-            <w:r/>
-            <w:r>
-              <w:rPr>
-                <w:b/>
-                <w:color w:val="555555"/>
-              </w:rPr>
-              <w:t>Minor</w:t>
-            </w:r>
-          </w:p>
-        </w:tc>
-        <w:tc>
-          <w:tcPr>
-            <w:tcW w:type="dxa" w:w="4896"/>
-          </w:tcPr>
-          <w:p>
-            <w:r>
-              <w:rPr>
-                <w:sz w:val="20"/>
-              </w:rPr>
-              <w:t>Training on SMOTE-resampled data distorts base rates and raw probability outputs. Although the calibration set is held out and unresampled (good), the interaction between resampling, calibration, and operating thresholds on the true (imbalanced) distribution is not analysed.</w:t>
-            </w:r>
-          </w:p>
-        </w:tc>
-        <w:tc>
-          <w:tcPr>
-            <w:tcW w:type="dxa" w:w="4320"/>
-          </w:tcPr>
-          <w:p>
-            <w:r>
-              <w:rPr>
-                <w:sz w:val="20"/>
-              </w:rPr>
-              <w:t>Discuss/validate the SMOTE×calibration interaction; compare against class-weighting (no resampling) and confirm calibration is evaluated on the natural class prior.</w:t>
-            </w:r>
-          </w:p>
-        </w:tc>
-      </w:tr>
-      <w:tr>
-        <w:tc>
-          <w:tcPr>
-            <w:tcW w:type="dxa" w:w="432"/>
-          </w:tcPr>
-          <w:p>
-            <w:r>
-              <w:rPr>
-                <w:sz w:val="20"/>
-              </w:rPr>
-              <w:t>19</w:t>
-            </w:r>
-          </w:p>
-        </w:tc>
-        <w:tc>
-          <w:tcPr>
-            <w:tcW w:type="dxa" w:w="2304"/>
-          </w:tcPr>
-          <w:p>
-            <w:r>
-              <w:rPr>
-                <w:sz w:val="20"/>
-              </w:rPr>
-              <w:t>Scope — Binary regime oversimplification</w:t>
-            </w:r>
-          </w:p>
-        </w:tc>
-        <w:tc>
-          <w:tcPr>
-            <w:tcW w:type="dxa" w:w="1008"/>
-          </w:tcPr>
-          <w:p>
-            <w:r/>
-            <w:r>
-              <w:rPr>
-                <w:b/>
-                <w:color w:val="555555"/>
-              </w:rPr>
-              <w:t>Minor</w:t>
-            </w:r>
-          </w:p>
-        </w:tc>
-        <w:tc>
-          <w:tcPr>
-            <w:tcW w:type="dxa" w:w="4896"/>
-          </w:tcPr>
-          <w:p>
-            <w:r>
-              <w:rPr>
-                <w:sz w:val="20"/>
-              </w:rPr>
-              <w:t>Real datasets routinely mix semantically rich and abstract/engineered features; a hard binary AFR/SFR assignment will misclassify such mixed datasets. The paper notes continuous regime scoring only as future work, which limits the generalisability of the current claims.</w:t>
-            </w:r>
-          </w:p>
-        </w:tc>
-        <w:tc>
-          <w:tcPr>
-            <w:tcW w:type="dxa" w:w="4320"/>
-          </w:tcPr>
-          <w:p>
-            <w:r>
-              <w:rPr>
-                <w:sz w:val="20"/>
-              </w:rPr>
-              <w:t>Acknowledge the limitation prominently and, ideally, demonstrate behaviour on at least one mixed-feature dataset.</w:t>
-            </w:r>
-          </w:p>
-        </w:tc>
-      </w:tr>
-      <w:tr>
-        <w:tc>
-          <w:tcPr>
-            <w:tcW w:type="dxa" w:w="432"/>
-          </w:tcPr>
-          <w:p>
-            <w:r>
-              <w:rPr>
-                <w:sz w:val="20"/>
-              </w:rPr>
-              <w:t>20</w:t>
-            </w:r>
-          </w:p>
-        </w:tc>
-        <w:tc>
-          <w:tcPr>
-            <w:tcW w:type="dxa" w:w="2304"/>
-          </w:tcPr>
-          <w:p>
-            <w:r>
-              <w:rPr>
-                <w:sz w:val="20"/>
-              </w:rPr>
-              <w:t>Experimental Design — Small, dated clinical benchmark</w:t>
-            </w:r>
-          </w:p>
-        </w:tc>
-        <w:tc>
-          <w:tcPr>
-            <w:tcW w:type="dxa" w:w="1008"/>
-          </w:tcPr>
-          <w:p>
-            <w:r/>
-            <w:r>
-              <w:rPr>
-                <w:b/>
-                <w:color w:val="555555"/>
-              </w:rPr>
-              <w:t>Minor</w:t>
-            </w:r>
-          </w:p>
-        </w:tc>
-        <w:tc>
-          <w:tcPr>
-            <w:tcW w:type="dxa" w:w="4896"/>
-          </w:tcPr>
-          <w:p>
-            <w:r>
-              <w:rPr>
-                <w:sz w:val="20"/>
-              </w:rPr>
-              <w:t>The UCI Cleveland Heart dataset (303 instances) is small and heavily reused, limiting external validity and statistical power for the SFR conclusions.</w:t>
-            </w:r>
-          </w:p>
-        </w:tc>
-        <w:tc>
-          <w:tcPr>
-            <w:tcW w:type="dxa" w:w="4320"/>
-          </w:tcPr>
-          <w:p>
-            <w:r>
-              <w:rPr>
-                <w:sz w:val="20"/>
-              </w:rPr>
-              <w:t>Add a larger and more contemporary clinical dataset to strengthen external validity for the semantic regime.</w:t>
-            </w:r>
-          </w:p>
-        </w:tc>
-      </w:tr>
     </w:tbl>
     <w:sectPr>
       <w:pgSz w:w="12240" w:h="15840"/>

</xml_diff>